<commit_message>
[docs] corregir nombres de archivos
</commit_message>
<xml_diff>
--- a/docs/01_metodologia/01_informe_metodologico_v2.docx
+++ b/docs/01_metodologia/01_informe_metodologico_v2.docx
@@ -1465,6 +1465,8 @@
       </w:pPr>
       <w:r>
         <w:t xml:space="preserve">La secuencia que conecta las cinco dimensiones puede resumirse así: una empresa que invierte en formación y desarrolla sus capacidades internas está en mejores condiciones de digitalizarse. Una empresa bien digitalizada puede avanzar más fácilmente hacia la automatización y hacia </w:t>
+      </w:r>
+      <w:r>
         <w:lastRenderedPageBreak/>
         <w:t>prácticas más sostenibles. Y una empresa que ha modernizado sus procesos de esta forma tiene más capacidad para colaborar con otras, integrarse en redes y fortalecer la posición de la empresa en el ecosistema productivo del vehículo eléctrico.</w:t>
       </w:r>
@@ -1616,6 +1618,8 @@
       </w:pPr>
       <w:r>
         <w:t xml:space="preserve">Concretamente, para cada empresa y cada año se calcula cuánto importe ejecutado corresponde a proyectos de investigación, cuánto a proyectos de desarrollo experimental y cuánto a proyectos de formación, normalizando cada cifra por el número de empleados. De esta forma, el modelo puede estimar si la investigación actúa principalmente reforzando capacidades y digitalización, si </w:t>
+      </w:r>
+      <w:r>
         <w:lastRenderedPageBreak/>
         <w:t>el desarrollo experimental empuja más la automatización, o si la formación opera sobre todo fortaleciendo la base interna de la empresa.</w:t>
       </w:r>
@@ -1626,11 +1630,7 @@
         <w:jc w:val="both"/>
       </w:pPr>
       <w:r>
-        <w:t>Al no disponer de los importes ejecutados definitivos</w:t>
-      </w:r>
-      <w:commentRangeStart w:id="0"/>
-      <w:r>
-        <w:t>, vamos a utilizar los importes concedidos, indicando expresamente esa limitación</w:t>
+        <w:t>Al no disponer de los importes ejecutados definitivos, vamos a utilizar los importes concedidos, indicando expresamente esa limitación</w:t>
       </w:r>
       <w:r>
         <w:rPr>
@@ -1640,15 +1640,6 @@
       </w:r>
       <w:r>
         <w:t>.</w:t>
-      </w:r>
-      <w:commentRangeEnd w:id="0"/>
-      <w:r>
-        <w:rPr>
-          <w:rStyle w:val="Refdecomentario"/>
-          <w:sz w:val="22"/>
-          <w:szCs w:val="22"/>
-        </w:rPr>
-        <w:commentReference w:id="0"/>
       </w:r>
     </w:p>
     <w:p>
@@ -1917,7 +1908,6 @@
             </w:tcMar>
           </w:tcPr>
           <w:p>
-            <w:commentRangeStart w:id="1"/>
             <w:r>
               <w:rPr>
                 <w:color w:val="000000"/>
@@ -1925,15 +1915,6 @@
                 <w:szCs w:val="20"/>
               </w:rPr>
               <w:t>Ventas, empleo, exportaciones, inversión en I+D de empresas similares no beneficiarias del programa</w:t>
-            </w:r>
-            <w:commentRangeEnd w:id="1"/>
-            <w:r>
-              <w:rPr>
-                <w:rStyle w:val="Refdecomentario"/>
-                <w:sz w:val="22"/>
-                <w:szCs w:val="22"/>
-              </w:rPr>
-              <w:commentReference w:id="1"/>
             </w:r>
           </w:p>
         </w:tc>
@@ -2821,6 +2802,7 @@
         <w:jc w:val="both"/>
       </w:pPr>
       <w:r>
+        <w:lastRenderedPageBreak/>
         <w:t>Los próximos pasos son la incorporación de los datos de SABI, la estimación del modelo completo con las dosis monetarias reales, y la construcción del análisis externo de impacto mediante control sintético.</w:t>
       </w:r>
     </w:p>
@@ -2842,7 +2824,6 @@
           <w:sz w:val="32"/>
           <w:szCs w:val="32"/>
         </w:rPr>
-        <w:lastRenderedPageBreak/>
         <w:t>PARTE II</w:t>
       </w:r>
     </w:p>
@@ -2933,35 +2914,55 @@
         <w:spacing w:after="160"/>
         <w:jc w:val="both"/>
       </w:pPr>
-      <w:r>
-        <w:t>ABSCAPit: capacidad de absorción tecnológica y capital humano. Mide la capacidad de la empresa para adquirir, asimilar, transformar y utilizar conocimiento externo, apoyándose en formación, competencias digitales, capacidades de gestión del cambio y habilidades de analítica de datos.</w:t>
-      </w:r>
-    </w:p>
-    <w:p>
-      <w:pPr>
-        <w:spacing w:after="160"/>
-        <w:jc w:val="both"/>
-      </w:pPr>
-      <w:r>
-        <w:t>Doseit: intensidad de tratamiento. Refleja el grado de exposición de la empresa a la ayuda del PERTE VEC1, medida como ayuda recibida normalizada por una magnitud pretratamiento (empleo, ventas o inversión elegible).</w:t>
-      </w:r>
-    </w:p>
-    <w:p>
-      <w:pPr>
-        <w:spacing w:after="160"/>
-        <w:jc w:val="both"/>
-      </w:pPr>
-      <w:r>
-        <w:t>Xit: vector de variables de control observables (tamaño, facturación, exportaciones, intensidad de I+D, productividad, cualificación laboral, CNAE, posición en la cadena de valor).</w:t>
-      </w:r>
-    </w:p>
-    <w:p>
-      <w:pPr>
-        <w:spacing w:after="160"/>
-        <w:jc w:val="both"/>
-      </w:pPr>
-      <w:r>
-        <w:t>τt: efecto temporal común del año t. Recoge shocks agregados o tendencias comunes a todas las empresas en cada año</w:t>
+      <w:proofErr w:type="spellStart"/>
+      <w:r>
+        <w:t>ABSCAPit</w:t>
+      </w:r>
+      <w:proofErr w:type="spellEnd"/>
+      <w:r>
+        <w:t>: capacidad de absorción tecnológica y capital humano. Mide la capacidad de la empresa para adquirir, asimilar, transformar y utilizar conocimiento externo, apoyándose en formación, competencias digitales, capacidades de gestión del cambio y habilidades de analítica de datos.</w:t>
+      </w:r>
+    </w:p>
+    <w:p>
+      <w:pPr>
+        <w:spacing w:after="160"/>
+        <w:jc w:val="both"/>
+      </w:pPr>
+      <w:proofErr w:type="spellStart"/>
+      <w:r>
+        <w:t>Doseit</w:t>
+      </w:r>
+      <w:proofErr w:type="spellEnd"/>
+      <w:r>
+        <w:t>: intensidad de tratamiento. Refleja el grado de exposición de la empresa a la ayuda del PERTE VEC1, medida como ayuda recibida normalizada por una magnitud pretratamiento (empleo, ventas o inversión elegible).</w:t>
+      </w:r>
+    </w:p>
+    <w:p>
+      <w:pPr>
+        <w:spacing w:after="160"/>
+        <w:jc w:val="both"/>
+      </w:pPr>
+      <w:proofErr w:type="spellStart"/>
+      <w:r>
+        <w:t>Xit</w:t>
+      </w:r>
+      <w:proofErr w:type="spellEnd"/>
+      <w:r>
+        <w:t>: vector de variables de control observables (tamaño, facturación, exportaciones, intensidad de I+D, productividad, cualificación laboral, CNAE, posición en la cadena de valor).</w:t>
+      </w:r>
+    </w:p>
+    <w:p>
+      <w:pPr>
+        <w:spacing w:after="160"/>
+        <w:jc w:val="both"/>
+      </w:pPr>
+      <w:proofErr w:type="spellStart"/>
+      <w:r>
+        <w:t>τt</w:t>
+      </w:r>
+      <w:proofErr w:type="spellEnd"/>
+      <w:r>
+        <w:t>: efecto temporal común del año t. Recoge shocks agregados o tendencias comunes a todas las empresas en cada año</w:t>
       </w:r>
       <w:r>
         <w:rPr>
@@ -2978,8 +2979,13 @@
         <w:spacing w:after="160"/>
         <w:jc w:val="both"/>
       </w:pPr>
-      <w:r>
-        <w:t>uit: término de error que captura factores no observados que afectan a DIGINT y que no están recogidos por las variables explicativas.</w:t>
+      <w:proofErr w:type="spellStart"/>
+      <w:r>
+        <w:t>uit</w:t>
+      </w:r>
+      <w:proofErr w:type="spellEnd"/>
+      <w:r>
+        <w:t>: término de error que captura factores no observados que afectan a DIGINT y que no están recogidos por las variables explicativas.</w:t>
       </w:r>
     </w:p>
     <w:p>
@@ -3011,8 +3017,14 @@
         <w:spacing w:after="160"/>
         <w:jc w:val="both"/>
       </w:pPr>
-      <w:r>
-        <w:t>DIGINTit se introduce como mecanismo previo: una empresa más digitalizada tiene más capacidad para desplegar automatización avanzada (simulación, gemelos digitales, robots, visión artificial, automatización logística).</w:t>
+      <w:proofErr w:type="spellStart"/>
+      <w:r>
+        <w:lastRenderedPageBreak/>
+        <w:t>DIGINTit</w:t>
+      </w:r>
+      <w:proofErr w:type="spellEnd"/>
+      <w:r>
+        <w:t xml:space="preserve"> se introduce como mecanismo previo: una empresa más digitalizada tiene más capacidad para desplegar automatización avanzada (simulación, gemelos digitales, robots, visión artificial, automatización logística).</w:t>
       </w:r>
     </w:p>
     <w:p>
@@ -3045,7 +3057,6 @@
         <w:jc w:val="both"/>
       </w:pPr>
       <w:r>
-        <w:lastRenderedPageBreak/>
         <w:t>Mide la transformación operativa vinculada a eficiencia energética, renovables, reducción de emisiones, gestión del agua, residuos y reciclaje. No se refiere a la gobernanza ambiental formal sino al desempeño operativo ambiental efectivo.</w:t>
       </w:r>
     </w:p>
@@ -3104,26 +3115,41 @@
         <w:spacing w:after="160"/>
         <w:jc w:val="both"/>
       </w:pPr>
-      <w:r>
-        <w:t>DoseINVit = importe ejecutado en proyectos de Investigación por la empresa i en el año t, normalizado por el empleo de 2022 (año base pretratamiento).</w:t>
-      </w:r>
-    </w:p>
-    <w:p>
-      <w:pPr>
-        <w:spacing w:after="160"/>
-        <w:jc w:val="both"/>
-      </w:pPr>
-      <w:r>
-        <w:t>DoseDEVit = importe ejecutado en proyectos de Desarrollo experimental, normalizado por el empleo de 2022 (año base pretratamiento).</w:t>
-      </w:r>
-    </w:p>
-    <w:p>
-      <w:pPr>
-        <w:spacing w:after="160"/>
-        <w:jc w:val="both"/>
-      </w:pPr>
-      <w:r>
-        <w:t>DoseABSit = importe ejecutado en proyectos de Formación/Absorción, normalizado por el empleo de 2022 (año base pretratamiento).</w:t>
+      <w:proofErr w:type="spellStart"/>
+      <w:r>
+        <w:t>DoseINVit</w:t>
+      </w:r>
+      <w:proofErr w:type="spellEnd"/>
+      <w:r>
+        <w:t xml:space="preserve"> = importe ejecutado en proyectos de Investigación por la empresa i en el año t, normalizado por el empleo de 2022 (año base pretratamiento).</w:t>
+      </w:r>
+    </w:p>
+    <w:p>
+      <w:pPr>
+        <w:spacing w:after="160"/>
+        <w:jc w:val="both"/>
+      </w:pPr>
+      <w:proofErr w:type="spellStart"/>
+      <w:r>
+        <w:t>DoseDEVit</w:t>
+      </w:r>
+      <w:proofErr w:type="spellEnd"/>
+      <w:r>
+        <w:t xml:space="preserve"> = importe ejecutado en proyectos de Desarrollo experimental, normalizado por el empleo de 2022 (año base pretratamiento).</w:t>
+      </w:r>
+    </w:p>
+    <w:p>
+      <w:pPr>
+        <w:spacing w:after="160"/>
+        <w:jc w:val="both"/>
+      </w:pPr>
+      <w:proofErr w:type="spellStart"/>
+      <w:r>
+        <w:t>DoseABSit</w:t>
+      </w:r>
+      <w:proofErr w:type="spellEnd"/>
+      <w:r>
+        <w:t xml:space="preserve"> = importe ejecutado en proyectos de Formación/Absorción, normalizado por el empleo de 2022 (año base pretratamiento).</w:t>
       </w:r>
     </w:p>
     <w:p>
@@ -3347,6 +3373,7 @@
         <w:jc w:val="both"/>
       </w:pPr>
       <w:r>
+        <w:lastRenderedPageBreak/>
         <w:t>Antes de agregar los ítems en un indicador se verifican tres condiciones. Primera, consistencia interna: los ítems asignados a cada constructo deben tener correlaciones positivas y significativas entre sí. La prueba formal es el Alpha de Cronbach, cuyo valor recomendado es superior a 0,70. Segunda, cobertura: no debe haber un número excesivo de respuestas ausentes, ya que una imputación masiva puede distorsionar el índice. Tercera, ausencia de valores atípicos extremos en variables continuas que puedan dominar el índice.</w:t>
       </w:r>
     </w:p>
@@ -3364,7 +3391,6 @@
         <w:jc w:val="both"/>
       </w:pPr>
       <w:r>
-        <w:lastRenderedPageBreak/>
         <w:t>El método preferido es el Análisis Factorial Confirmatorio (AFC), que permite contrastar si la estructura teórica propuesta —que un conjunto dado de ítems mide el constructo asignado— es coherente con los datos. A diferencia del análisis exploratorio, el AFC parte de una hipótesis teórica sobre qué mide cada pregunta.</w:t>
       </w:r>
     </w:p>
@@ -3443,7 +3469,15 @@
         <w:jc w:val="both"/>
       </w:pPr>
       <w:r>
-        <w:t xml:space="preserve">Tercero, revisión de índices de modificación si el ajuste es insatisfactorio, evitando re-especificaciones sin justificación sustantiva. </w:t>
+        <w:t xml:space="preserve">Tercero, revisión de índices de modificación si el ajuste es insatisfactorio, evitando </w:t>
+      </w:r>
+      <w:proofErr w:type="spellStart"/>
+      <w:r>
+        <w:t>re-especificaciones</w:t>
+      </w:r>
+      <w:proofErr w:type="spellEnd"/>
+      <w:r>
+        <w:t xml:space="preserve"> sin justificación sustantiva. </w:t>
       </w:r>
     </w:p>
     <w:p>
@@ -3478,7 +3512,71 @@
         <w:jc w:val="both"/>
       </w:pPr>
       <w:r>
-        <w:t>Se aplicará imputación múltiple mediante el método MICE (Multiple Imputation by Chained Equations), que genera varias versiones del conjunto de datos con distintos valores imputados y combina los resultados con las reglas de Rubin. Esta estrategia es preferible a la eliminación de casos completos (listwise deletion) y a la imputación por la media. Los resultados principales se presentarán bajo la imputación múltiple como especificación base, con la estimación por eliminación de casos como análisis de sensibilidad.</w:t>
+        <w:t>Se aplicará imputación múltiple mediante el método MICE (</w:t>
+      </w:r>
+      <w:proofErr w:type="spellStart"/>
+      <w:r>
+        <w:t>Multiple</w:t>
+      </w:r>
+      <w:proofErr w:type="spellEnd"/>
+      <w:r>
+        <w:t xml:space="preserve"> </w:t>
+      </w:r>
+      <w:proofErr w:type="spellStart"/>
+      <w:r>
+        <w:t>Imputation</w:t>
+      </w:r>
+      <w:proofErr w:type="spellEnd"/>
+      <w:r>
+        <w:t xml:space="preserve"> </w:t>
+      </w:r>
+      <w:proofErr w:type="spellStart"/>
+      <w:r>
+        <w:t>by</w:t>
+      </w:r>
+      <w:proofErr w:type="spellEnd"/>
+      <w:r>
+        <w:t xml:space="preserve"> </w:t>
+      </w:r>
+      <w:proofErr w:type="spellStart"/>
+      <w:r>
+        <w:t>Chained</w:t>
+      </w:r>
+      <w:proofErr w:type="spellEnd"/>
+      <w:r>
+        <w:t xml:space="preserve"> </w:t>
+      </w:r>
+      <w:proofErr w:type="spellStart"/>
+      <w:r>
+        <w:t>Equations</w:t>
+      </w:r>
+      <w:proofErr w:type="spellEnd"/>
+      <w:r>
+        <w:t xml:space="preserve">), que genera varias versiones del conjunto de datos con distintos valores imputados y combina los resultados con las reglas de </w:t>
+      </w:r>
+      <w:proofErr w:type="spellStart"/>
+      <w:r>
+        <w:t>Rubin</w:t>
+      </w:r>
+      <w:proofErr w:type="spellEnd"/>
+      <w:r>
+        <w:t>. Esta estrategia es preferible a la eliminación de casos completos (</w:t>
+      </w:r>
+      <w:proofErr w:type="spellStart"/>
+      <w:r>
+        <w:t>listwise</w:t>
+      </w:r>
+      <w:proofErr w:type="spellEnd"/>
+      <w:r>
+        <w:t xml:space="preserve"> </w:t>
+      </w:r>
+      <w:proofErr w:type="spellStart"/>
+      <w:r>
+        <w:t>deletion</w:t>
+      </w:r>
+      <w:proofErr w:type="spellEnd"/>
+      <w:r>
+        <w:t>) y a la imputación por la media. Los resultados principales se presentarán bajo la imputación múltiple como especificación base, con la estimación por eliminación de casos como análisis de sensibilidad.</w:t>
       </w:r>
     </w:p>
     <w:p>
@@ -3486,6 +3584,7 @@
         <w:pStyle w:val="Ttulo2"/>
       </w:pPr>
       <w:r>
+        <w:lastRenderedPageBreak/>
         <w:t>B.4. Matriz resumida de constructos e indicadores</w:t>
       </w:r>
     </w:p>
@@ -3652,9 +3751,7 @@
               <w:rPr>
                 <w:lang w:val="es-ES"/>
               </w:rPr>
-              <w:t xml:space="preserve">ERP/MES, ratio de líneas digitalizadas, BI, mantenimiento </w:t>
-              <w:lastRenderedPageBreak/>
-              <w:t>predictivo, interacción con proveedores</w:t>
+              <w:t>ERP/MES, ratio de líneas digitalizadas, BI, mantenimiento predictivo, interacción con proveedores</w:t>
             </w:r>
           </w:p>
         </w:tc>
@@ -3680,10 +3777,7 @@
               <w:rPr>
                 <w:lang w:val="es-ES"/>
               </w:rPr>
-              <w:lastRenderedPageBreak/>
-              <w:t xml:space="preserve">Escalas ordinales cuando proceda; ratios </w:t>
-              <w:lastRenderedPageBreak/>
-              <w:t>0–100; estandarización</w:t>
+              <w:t>Escalas ordinales cuando proceda; ratios 0–100; estandarización</w:t>
             </w:r>
           </w:p>
         </w:tc>
@@ -3709,7 +3803,6 @@
               <w:rPr>
                 <w:lang w:val="es-ES"/>
               </w:rPr>
-              <w:lastRenderedPageBreak/>
               <w:t>DIGINT</w:t>
             </w:r>
           </w:p>
@@ -3898,11 +3991,19 @@
                 <w:lang w:val="es-ES"/>
               </w:rPr>
             </w:pPr>
-            <w:r>
-              <w:rPr>
-                <w:lang w:val="es-ES"/>
-              </w:rPr>
-              <w:t>Ln (1+x), shares y estandarización</w:t>
+            <w:proofErr w:type="spellStart"/>
+            <w:r>
+              <w:rPr>
+                <w:lang w:val="es-ES"/>
+              </w:rPr>
+              <w:t>Ln</w:t>
+            </w:r>
+            <w:proofErr w:type="spellEnd"/>
+            <w:r>
+              <w:rPr>
+                <w:lang w:val="es-ES"/>
+              </w:rPr>
+              <w:t xml:space="preserve"> (1+x), shares y estandarización</w:t>
             </w:r>
           </w:p>
         </w:tc>
@@ -4007,11 +4108,19 @@
                 <w:lang w:val="es-ES"/>
               </w:rPr>
             </w:pPr>
-            <w:r>
-              <w:rPr>
-                <w:lang w:val="es-ES"/>
-              </w:rPr>
-              <w:t>Ln (1+x), ratios y normalización por tamaño</w:t>
+            <w:proofErr w:type="spellStart"/>
+            <w:r>
+              <w:rPr>
+                <w:lang w:val="es-ES"/>
+              </w:rPr>
+              <w:t>Ln</w:t>
+            </w:r>
+            <w:proofErr w:type="spellEnd"/>
+            <w:r>
+              <w:rPr>
+                <w:lang w:val="es-ES"/>
+              </w:rPr>
+              <w:t xml:space="preserve"> (1+x), ratios y normalización por tamaño</w:t>
             </w:r>
           </w:p>
         </w:tc>
@@ -4225,11 +4334,19 @@
                 <w:lang w:val="es-ES"/>
               </w:rPr>
             </w:pPr>
-            <w:r>
-              <w:rPr>
-                <w:lang w:val="es-ES"/>
-              </w:rPr>
-              <w:t>Ln (1+x) y normalización por proyectos</w:t>
+            <w:proofErr w:type="spellStart"/>
+            <w:r>
+              <w:rPr>
+                <w:lang w:val="es-ES"/>
+              </w:rPr>
+              <w:t>Ln</w:t>
+            </w:r>
+            <w:proofErr w:type="spellEnd"/>
+            <w:r>
+              <w:rPr>
+                <w:lang w:val="es-ES"/>
+              </w:rPr>
+              <w:t xml:space="preserve"> (1+x) y normalización por proyectos</w:t>
             </w:r>
           </w:p>
         </w:tc>
@@ -4334,11 +4451,19 @@
                 <w:lang w:val="es-ES"/>
               </w:rPr>
             </w:pPr>
-            <w:r>
-              <w:rPr>
-                <w:lang w:val="es-ES"/>
-              </w:rPr>
-              <w:t>Ln (1+x); índice de diversidad</w:t>
+            <w:proofErr w:type="spellStart"/>
+            <w:r>
+              <w:rPr>
+                <w:lang w:val="es-ES"/>
+              </w:rPr>
+              <w:t>Ln</w:t>
+            </w:r>
+            <w:proofErr w:type="spellEnd"/>
+            <w:r>
+              <w:rPr>
+                <w:lang w:val="es-ES"/>
+              </w:rPr>
+              <w:t xml:space="preserve"> (1+x); índice de diversidad</w:t>
             </w:r>
           </w:p>
         </w:tc>
@@ -4443,11 +4568,19 @@
                 <w:lang w:val="es-ES"/>
               </w:rPr>
             </w:pPr>
-            <w:r>
-              <w:rPr>
-                <w:lang w:val="es-ES"/>
-              </w:rPr>
-              <w:t>Ln (1+x) o ratio sobre plantilla</w:t>
+            <w:proofErr w:type="spellStart"/>
+            <w:r>
+              <w:rPr>
+                <w:lang w:val="es-ES"/>
+              </w:rPr>
+              <w:t>Ln</w:t>
+            </w:r>
+            <w:proofErr w:type="spellEnd"/>
+            <w:r>
+              <w:rPr>
+                <w:lang w:val="es-ES"/>
+              </w:rPr>
+              <w:t xml:space="preserve"> (1+x) o ratio sobre plantilla</w:t>
             </w:r>
           </w:p>
         </w:tc>
@@ -4665,7 +4798,21 @@
               <w:rPr>
                 <w:lang w:val="es-ES"/>
               </w:rPr>
-              <w:t>Logs, ratios y dummies (binarias transformadas) sectoriales</w:t>
+              <w:t xml:space="preserve">Logs, ratios y </w:t>
+            </w:r>
+            <w:proofErr w:type="spellStart"/>
+            <w:r>
+              <w:rPr>
+                <w:lang w:val="es-ES"/>
+              </w:rPr>
+              <w:t>dummies</w:t>
+            </w:r>
+            <w:proofErr w:type="spellEnd"/>
+            <w:r>
+              <w:rPr>
+                <w:lang w:val="es-ES"/>
+              </w:rPr>
+              <w:t xml:space="preserve"> (binarias transformadas) sectoriales</w:t>
             </w:r>
           </w:p>
         </w:tc>
@@ -4728,9 +4875,8 @@
         <w:jc w:val="both"/>
       </w:pPr>
       <w:r>
-        <w:t xml:space="preserve">En el sistema estructural, DIGINT aparece como variable dependiente en la primera ecuación y como variable independiente en la segunda y en la cuarta. AUTO4 y SUSTOP tienen el mismo doble papel. Esta estructura genera correlación entre esas variables y los términos de error de las ecuaciones en que aparecen como variables independientes. Si esa correlación existe, la </w:t>
         <w:lastRenderedPageBreak/>
-        <w:t>estimación por MCO (mínimos cuadrados ordinarios) producirá coeficientes sesgados e inconsistentes, incluso en muestras grandes.</w:t>
+        <w:t>En el sistema estructural, DIGINT aparece como variable dependiente en la primera ecuación y como variable independiente en la segunda y en la cuarta. AUTO4 y SUSTOP tienen el mismo doble papel. Esta estructura genera correlación entre esas variables y los términos de error de las ecuaciones en que aparecen como variables independientes. Si esa correlación existe, la estimación por MCO (mínimos cuadrados ordinarios) producirá coeficientes sesgados e inconsistentes, incluso en muestras grandes.</w:t>
       </w:r>
     </w:p>
     <w:p>
@@ -4887,18 +5033,52 @@
         <w:jc w:val="both"/>
       </w:pPr>
       <w:r>
-        <w:t>La fase externa aproxima qué habría ocurrido con las empresas beneficiarias en ausencia del programa. Para ello se construye un contrafactual a partir de empresas no beneficiarias comparables obtenidas de SABI, complementadas cuando sea necesario con ORBIS, OEPM/EPO para patentes y registros de ayudas para depurar controles contaminados.</w:t>
-      </w:r>
-    </w:p>
-    <w:p>
-      <w:pPr>
-        <w:spacing w:after="160"/>
-        <w:jc w:val="both"/>
-      </w:pPr>
-      <w:r>
-        <w:t xml:space="preserve">Formalmente, si Y₁t es el resultado de la unidad tratada y Yjt el resultado de la empresa no tratada j, el contrafactual sintético se construye como Ŷᴺ₁t = Σⱼ wⱼYjt, con pesos wⱼ no negativos y suma </w:t>
+        <w:t xml:space="preserve">La fase externa aproxima qué habría ocurrido con las empresas beneficiarias en ausencia del programa. Para ello se construye un contrafactual a partir de empresas no beneficiarias </w:t>
+      </w:r>
+      <w:r>
         <w:lastRenderedPageBreak/>
-        <w:t>unitaria. El efecto estimado es τ̂₁t = Y₁t - Ŷᴺ₁t. Una separación persistente entre la trayectoria observada y la sintética, con buen ajuste pretratamiento, constituye la estimación del impacto atribuible.</w:t>
+        <w:t>comparables obtenidas de SABI, complementadas cuando sea necesario con ORBIS, OEPM/EPO para patentes y registros de ayudas para depurar controles contaminados.</w:t>
+      </w:r>
+    </w:p>
+    <w:p>
+      <w:pPr>
+        <w:spacing w:after="160"/>
+        <w:jc w:val="both"/>
+      </w:pPr>
+      <w:r>
+        <w:t xml:space="preserve">Formalmente, si </w:t>
+      </w:r>
+      <w:proofErr w:type="spellStart"/>
+      <w:r>
+        <w:t>Y₁t</w:t>
+      </w:r>
+      <w:proofErr w:type="spellEnd"/>
+      <w:r>
+        <w:t xml:space="preserve"> es el resultado de la unidad tratada y </w:t>
+      </w:r>
+      <w:proofErr w:type="spellStart"/>
+      <w:r>
+        <w:t>Yjt</w:t>
+      </w:r>
+      <w:proofErr w:type="spellEnd"/>
+      <w:r>
+        <w:t xml:space="preserve"> el resultado de la empresa no tratada j, el contrafactual sintético se construye como Ŷᴺ₁t = Σⱼ </w:t>
+      </w:r>
+      <w:proofErr w:type="spellStart"/>
+      <w:r>
+        <w:t>wⱼYjt</w:t>
+      </w:r>
+      <w:proofErr w:type="spellEnd"/>
+      <w:r>
+        <w:t xml:space="preserve">, con pesos wⱼ no negativos y suma unitaria. El efecto estimado es τ̂₁t = </w:t>
+      </w:r>
+      <w:proofErr w:type="spellStart"/>
+      <w:r>
+        <w:t>Y₁t</w:t>
+      </w:r>
+      <w:proofErr w:type="spellEnd"/>
+      <w:r>
+        <w:t xml:space="preserve"> - Ŷᴺ₁t. Una separación persistente entre la trayectoria observada y la sintética, con buen ajuste pretratamiento, constituye la estimación del impacto atribuible.</w:t>
       </w:r>
     </w:p>
     <w:p>
@@ -4949,7 +5129,15 @@
         <w:jc w:val="both"/>
       </w:pPr>
       <w:r>
-        <w:t>El grupo debe formarse con empresas no beneficiarias del PERTE VEC1 comparables en CNAE, tamaño, antigüedad, estructura exportadora y perfil tecnológico previo. Filtros de inclusión: mismo CNAE a dos dígitos que alguna beneficiaria, umbral mínimo de 10 empleados, cuentas depositadas en todos los años 2019–2024. Se excluyen del grupo los CIFs de las 256 empresas beneficiarias.</w:t>
+        <w:t xml:space="preserve">El grupo debe formarse con empresas no beneficiarias del PERTE VEC1 comparables en CNAE, tamaño, antigüedad, estructura exportadora y perfil tecnológico previo. Filtros de inclusión: mismo CNAE a dos dígitos que alguna beneficiaria, umbral mínimo de 10 empleados, cuentas depositadas en todos los años 2019–2024. Se excluyen del grupo los </w:t>
+      </w:r>
+      <w:proofErr w:type="spellStart"/>
+      <w:r>
+        <w:t>CIFs</w:t>
+      </w:r>
+      <w:proofErr w:type="spellEnd"/>
+      <w:r>
+        <w:t xml:space="preserve"> de las 256 empresas beneficiarias.</w:t>
       </w:r>
     </w:p>
     <w:p>
@@ -4975,16 +5163,32 @@
         <w:jc w:val="both"/>
       </w:pPr>
       <w:r>
-        <w:t>Período de ajuste pretratamiento: mínimo 2019–2023 (preferiblemente desde 2019 para contar con al menos cuatro años). Período post-tratamiento para la estimación del impacto: 2024–2025.</w:t>
-      </w:r>
-    </w:p>
-    <w:p>
-      <w:pPr>
-        <w:spacing w:after="160"/>
-        <w:jc w:val="both"/>
-      </w:pPr>
-      <w:r>
-        <w:t>Inferencia mediante tests placebo: La pregunta que queremos responder es: ¿el efecto que estimamos para las empresas beneficiarias del PERTE VEC es genuinamente grande, o podría haberse obtenido por pura casualidad aplicando el mismo método a cualquier empresa?</w:t>
+        <w:t xml:space="preserve">Período de ajuste pretratamiento: mínimo 2019–2023 (preferiblemente desde 2019 para contar con al menos cuatro años). Período </w:t>
+      </w:r>
+      <w:proofErr w:type="spellStart"/>
+      <w:r>
+        <w:t>post-tratamiento</w:t>
+      </w:r>
+      <w:proofErr w:type="spellEnd"/>
+      <w:r>
+        <w:t xml:space="preserve"> para la estimación del impacto: 2024–2025.</w:t>
+      </w:r>
+    </w:p>
+    <w:p>
+      <w:pPr>
+        <w:spacing w:after="160"/>
+        <w:jc w:val="both"/>
+      </w:pPr>
+      <w:r>
+        <w:t xml:space="preserve">Inferencia mediante </w:t>
+      </w:r>
+      <w:proofErr w:type="spellStart"/>
+      <w:r>
+        <w:t>tests</w:t>
+      </w:r>
+      <w:proofErr w:type="spellEnd"/>
+      <w:r>
+        <w:t xml:space="preserve"> placebo: La pregunta que queremos responder es: ¿el efecto que estimamos para las empresas beneficiarias del PERTE VEC es genuinamente grande, o podría haberse obtenido por pura casualidad aplicando el mismo método a cualquier empresa?</w:t>
       </w:r>
     </w:p>
     <w:p>
@@ -5011,7 +5215,31 @@
         <w:jc w:val="both"/>
       </w:pPr>
       <w:r>
-        <w:t>Para múltiples unidades tratadas, considerar el método Synthetic Difference-in-Differences (Arkhangelsky et al., 2021) como especificación alternativa.</w:t>
+        <w:t xml:space="preserve">Para múltiples unidades tratadas, considerar el método </w:t>
+      </w:r>
+      <w:proofErr w:type="spellStart"/>
+      <w:r>
+        <w:t>Synthetic</w:t>
+      </w:r>
+      <w:proofErr w:type="spellEnd"/>
+      <w:r>
+        <w:t xml:space="preserve"> </w:t>
+      </w:r>
+      <w:proofErr w:type="spellStart"/>
+      <w:r>
+        <w:t>Difference</w:t>
+      </w:r>
+      <w:proofErr w:type="spellEnd"/>
+      <w:r>
+        <w:t>-in-</w:t>
+      </w:r>
+      <w:proofErr w:type="spellStart"/>
+      <w:r>
+        <w:t>Differences</w:t>
+      </w:r>
+      <w:proofErr w:type="spellEnd"/>
+      <w:r>
+        <w:t xml:space="preserve"> (Arkhangelsky et al., 2021) como especificación alternativa.</w:t>
       </w:r>
     </w:p>
     <w:p>
@@ -5028,16 +5256,32 @@
         <w:jc w:val="both"/>
       </w:pPr>
       <w:r>
-        <w:t>Se va a trabajar con el panel no equilibrado, eso supone documentar cuántas empresas tienen observaciones en todos los años y cuántas solo en parte, a continuación, se compara las características pretratamiento de las empresas que permanecen con las que abandonan. Si la diferencia es estadísticamente significativa, se corrige mediante ponderación por la inversa de la probabilidad de permanencia (IPW) o imputación múltiple. Por último se presentaran los resultados con y sin corrección.</w:t>
-      </w:r>
-    </w:p>
-    <w:p>
-      <w:pPr>
-        <w:spacing w:after="160"/>
-        <w:jc w:val="both"/>
-      </w:pPr>
-      <w:r>
         <w:lastRenderedPageBreak/>
+        <w:t xml:space="preserve">Se va a trabajar con el panel no equilibrado, eso supone documentar cuántas empresas tienen observaciones en todos los años y cuántas solo en parte, a continuación, se compara las características pretratamiento de las empresas que permanecen con las que abandonan. Si la diferencia es estadísticamente significativa, se corrige mediante ponderación por la inversa de la probabilidad de permanencia (IPW) o imputación múltiple. Por </w:t>
+      </w:r>
+      <w:proofErr w:type="gramStart"/>
+      <w:r>
+        <w:t>último</w:t>
+      </w:r>
+      <w:proofErr w:type="gramEnd"/>
+      <w:r>
+        <w:t xml:space="preserve"> se </w:t>
+      </w:r>
+      <w:proofErr w:type="gramStart"/>
+      <w:r>
+        <w:t>presentaran</w:t>
+      </w:r>
+      <w:proofErr w:type="gramEnd"/>
+      <w:r>
+        <w:t xml:space="preserve"> los resultados con y sin corrección.</w:t>
+      </w:r>
+    </w:p>
+    <w:p>
+      <w:pPr>
+        <w:spacing w:after="160"/>
+        <w:jc w:val="both"/>
+      </w:pPr>
+      <w:r>
         <w:t>El año base es el 2023, que es el año de inicio del tratamiento (el año en que se concedieron las subvenciones del PERTE VEC1). Este año base no debe confundirse con el año de referencia de los efectos fijos de año, que es 2022 (último año pretratamiento): los coeficientes temporales del modelo miden la variación respecto a 2022, mientras que 2023 es el punto de partida del impacto que se quiere estimar.</w:t>
       </w:r>
     </w:p>
@@ -5056,64 +5300,6 @@
 </w:document>
 </file>
 
-<file path=word/comments.xml><?xml version="1.0" encoding="utf-8"?>
-<w:comments xmlns:wpc="http://schemas.microsoft.com/office/word/2010/wordprocessingCanvas" xmlns:cx="http://schemas.microsoft.com/office/drawing/2014/chartex" xmlns:cx1="http://schemas.microsoft.com/office/drawing/2015/9/8/chartex" xmlns:cx2="http://schemas.microsoft.com/office/drawing/2015/10/21/chartex" xmlns:cx3="http://schemas.microsoft.com/office/drawing/2016/5/9/chartex" xmlns:cx4="http://schemas.microsoft.com/office/drawing/2016/5/10/chartex" xmlns:cx5="http://schemas.microsoft.com/office/drawing/2016/5/11/chartex" xmlns:cx6="http://schemas.microsoft.com/office/drawing/2016/5/12/chartex" xmlns:cx7="http://schemas.microsoft.com/office/drawing/2016/5/13/chartex" xmlns:cx8="http://schemas.microsoft.com/office/drawing/2016/5/14/chartex" xmlns:mc="http://schemas.openxmlformats.org/markup-compatibility/2006" xmlns:aink="http://schemas.microsoft.com/office/drawing/2016/ink" xmlns:am3d="http://schemas.microsoft.com/office/drawing/2017/model3d" xmlns:o="urn:schemas-microsoft-com:office:office" xmlns:oel="http://schemas.microsoft.com/office/2019/extlst" xmlns:r="http://schemas.openxmlformats.org/officeDocument/2006/relationships" xmlns:m="http://schemas.openxmlformats.org/officeDocument/2006/math" xmlns:v="urn:schemas-microsoft-com:vml" xmlns:wp14="http://schemas.microsoft.com/office/word/2010/wordprocessingDrawing" xmlns:wp="http://schemas.openxmlformats.org/drawingml/2006/wordprocessingDrawing" xmlns:w10="urn:schemas-microsoft-com:office:word" xmlns:w="http://schemas.openxmlformats.org/wordprocessingml/2006/main" xmlns:w14="http://schemas.microsoft.com/office/word/2010/wordml" xmlns:w15="http://schemas.microsoft.com/office/word/2012/wordml" xmlns:w16cex="http://schemas.microsoft.com/office/word/2018/wordml/cex" xmlns:w16cid="http://schemas.microsoft.com/office/word/2016/wordml/cid" xmlns:w16="http://schemas.microsoft.com/office/word/2018/wordml" xmlns:w16du="http://schemas.microsoft.com/office/word/2023/wordml/word16du" xmlns:w16sdtdh="http://schemas.microsoft.com/office/word/2020/wordml/sdtdatahash" xmlns:w16sdtfl="http://schemas.microsoft.com/office/word/2024/wordml/sdtformatlock" xmlns:w16se="http://schemas.microsoft.com/office/word/2015/wordml/symex" xmlns:wpg="http://schemas.microsoft.com/office/word/2010/wordprocessingGroup" xmlns:wpi="http://schemas.microsoft.com/office/word/2010/wordprocessingInk" xmlns:wne="http://schemas.microsoft.com/office/word/2006/wordml" xmlns:wps="http://schemas.microsoft.com/office/word/2010/wordprocessingShape" mc:Ignorable="w14 w15 w16se w16cid w16 w16cex w16sdtdh w16sdtfl w16du wp14">
-  <w:comment w:id="0" w:author="Arturo M. Ronda" w:date="2026-04-06T11:54:00Z" w:initials="AM">
-    <w:p>
-      <w:pPr>
-        <w:pStyle w:val="Textocomentario"/>
-      </w:pPr>
-      <w:r>
-        <w:rPr>
-          <w:rStyle w:val="Refdecomentario"/>
-        </w:rPr>
-        <w:annotationRef/>
-      </w:r>
-      <w:r>
-        <w:t>Me parece muy complicado saber como gastan anualmente la subvención. De hecho se la dan al principio tengo entendido, con lo que no se como vamos a ver el tema de la subvención anual utilizada de los proyectos</w:t>
-      </w:r>
-    </w:p>
-  </w:comment>
-  <w:comment w:id="1" w:author="Arturo M. Ronda" w:date="2026-04-06T11:52:00Z" w:initials="AM">
-    <w:p>
-      <w:pPr>
-        <w:pStyle w:val="Textocomentario"/>
-      </w:pPr>
-      <w:r>
-        <w:rPr>
-          <w:rStyle w:val="Refdecomentario"/>
-        </w:rPr>
-        <w:annotationRef/>
-      </w:r>
-      <w:r>
-        <w:t>Eres consciente de que Inversión en I+D tendremos datos muy limitados solo de grandes empresas, y que las exportaciones son datos que pueden ser también parciales?</w:t>
-      </w:r>
-    </w:p>
-  </w:comment>
-</w:comments>
-</file>
-
-<file path=word/commentsExtended.xml><?xml version="1.0" encoding="utf-8"?>
-<w15:commentsEx xmlns:wpc="http://schemas.microsoft.com/office/word/2010/wordprocessingCanvas" xmlns:cx="http://schemas.microsoft.com/office/drawing/2014/chartex" xmlns:cx1="http://schemas.microsoft.com/office/drawing/2015/9/8/chartex" xmlns:cx2="http://schemas.microsoft.com/office/drawing/2015/10/21/chartex" xmlns:cx3="http://schemas.microsoft.com/office/drawing/2016/5/9/chartex" xmlns:cx4="http://schemas.microsoft.com/office/drawing/2016/5/10/chartex" xmlns:cx5="http://schemas.microsoft.com/office/drawing/2016/5/11/chartex" xmlns:cx6="http://schemas.microsoft.com/office/drawing/2016/5/12/chartex" xmlns:cx7="http://schemas.microsoft.com/office/drawing/2016/5/13/chartex" xmlns:cx8="http://schemas.microsoft.com/office/drawing/2016/5/14/chartex" xmlns:mc="http://schemas.openxmlformats.org/markup-compatibility/2006" xmlns:aink="http://schemas.microsoft.com/office/drawing/2016/ink" xmlns:am3d="http://schemas.microsoft.com/office/drawing/2017/model3d" xmlns:o="urn:schemas-microsoft-com:office:office" xmlns:oel="http://schemas.microsoft.com/office/2019/extlst" xmlns:r="http://schemas.openxmlformats.org/officeDocument/2006/relationships" xmlns:m="http://schemas.openxmlformats.org/officeDocument/2006/math" xmlns:v="urn:schemas-microsoft-com:vml" xmlns:wp14="http://schemas.microsoft.com/office/word/2010/wordprocessingDrawing" xmlns:wp="http://schemas.openxmlformats.org/drawingml/2006/wordprocessingDrawing" xmlns:w10="urn:schemas-microsoft-com:office:word" xmlns:w="http://schemas.openxmlformats.org/wordprocessingml/2006/main" xmlns:w14="http://schemas.microsoft.com/office/word/2010/wordml" xmlns:w15="http://schemas.microsoft.com/office/word/2012/wordml" xmlns:w16cex="http://schemas.microsoft.com/office/word/2018/wordml/cex" xmlns:w16cid="http://schemas.microsoft.com/office/word/2016/wordml/cid" xmlns:w16="http://schemas.microsoft.com/office/word/2018/wordml" xmlns:w16du="http://schemas.microsoft.com/office/word/2023/wordml/word16du" xmlns:w16sdtdh="http://schemas.microsoft.com/office/word/2020/wordml/sdtdatahash" xmlns:w16sdtfl="http://schemas.microsoft.com/office/word/2024/wordml/sdtformatlock" xmlns:w16se="http://schemas.microsoft.com/office/word/2015/wordml/symex" xmlns:wpg="http://schemas.microsoft.com/office/word/2010/wordprocessingGroup" xmlns:wpi="http://schemas.microsoft.com/office/word/2010/wordprocessingInk" xmlns:wne="http://schemas.microsoft.com/office/word/2006/wordml" xmlns:wps="http://schemas.microsoft.com/office/word/2010/wordprocessingShape" mc:Ignorable="w14 w15 w16se w16cid w16 w16cex w16sdtdh w16sdtfl w16du wp14">
-  <w15:commentEx w15:paraId="01A085CA" w15:done="1"/>
-  <w15:commentEx w15:paraId="3707E922" w15:done="1"/>
-</w15:commentsEx>
-</file>
-
-<file path=word/commentsExtensible.xml><?xml version="1.0" encoding="utf-8"?>
-<w16cex:commentsExtensible xmlns:wpc="http://schemas.microsoft.com/office/word/2010/wordprocessingCanvas" xmlns:cx="http://schemas.microsoft.com/office/drawing/2014/chartex" xmlns:cx1="http://schemas.microsoft.com/office/drawing/2015/9/8/chartex" xmlns:cx2="http://schemas.microsoft.com/office/drawing/2015/10/21/chartex" xmlns:cx3="http://schemas.microsoft.com/office/drawing/2016/5/9/chartex" xmlns:cx4="http://schemas.microsoft.com/office/drawing/2016/5/10/chartex" xmlns:cx5="http://schemas.microsoft.com/office/drawing/2016/5/11/chartex" xmlns:cx6="http://schemas.microsoft.com/office/drawing/2016/5/12/chartex" xmlns:cx7="http://schemas.microsoft.com/office/drawing/2016/5/13/chartex" xmlns:cx8="http://schemas.microsoft.com/office/drawing/2016/5/14/chartex" xmlns:cr="http://schemas.microsoft.com/office/comments/2020/reactions" xmlns:mc="http://schemas.openxmlformats.org/markup-compatibility/2006" xmlns:aink="http://schemas.microsoft.com/office/drawing/2016/ink" xmlns:am3d="http://schemas.microsoft.com/office/drawing/2017/model3d" xmlns:o="urn:schemas-microsoft-com:office:office" xmlns:oel="http://schemas.microsoft.com/office/2019/extlst" xmlns:r="http://schemas.openxmlformats.org/officeDocument/2006/relationships" xmlns:m="http://schemas.openxmlformats.org/officeDocument/2006/math" xmlns:v="urn:schemas-microsoft-com:vml" xmlns:wp14="http://schemas.microsoft.com/office/word/2010/wordprocessingDrawing" xmlns:wp="http://schemas.openxmlformats.org/drawingml/2006/wordprocessingDrawing" xmlns:w10="urn:schemas-microsoft-com:office:word" xmlns:w="http://schemas.openxmlformats.org/wordprocessingml/2006/main" xmlns:w14="http://schemas.microsoft.com/office/word/2010/wordml" xmlns:w15="http://schemas.microsoft.com/office/word/2012/wordml" xmlns:w16cex="http://schemas.microsoft.com/office/word/2018/wordml/cex" xmlns:w16cid="http://schemas.microsoft.com/office/word/2016/wordml/cid" xmlns:w16="http://schemas.microsoft.com/office/word/2018/wordml" xmlns:w16du="http://schemas.microsoft.com/office/word/2023/wordml/word16du" xmlns:w16sdtdh="http://schemas.microsoft.com/office/word/2020/wordml/sdtdatahash" xmlns:w16sdtfl="http://schemas.microsoft.com/office/word/2024/wordml/sdtformatlock" xmlns:w16se="http://schemas.microsoft.com/office/word/2015/wordml/symex" xmlns:wpg="http://schemas.microsoft.com/office/word/2010/wordprocessingGroup" xmlns:wpi="http://schemas.microsoft.com/office/word/2010/wordprocessingInk" xmlns:wne="http://schemas.microsoft.com/office/word/2006/wordml" xmlns:wps="http://schemas.microsoft.com/office/word/2010/wordprocessingShape" mc:Ignorable="w14 w15 w16se w16cid w16 w16cex w16sdtdh w16sdtfl cr w16du wp14">
-  <w16cex:commentExtensible w16cex:durableId="22D8539F" w16cex:dateUtc="2026-04-06T09:54:00Z"/>
-  <w16cex:commentExtensible w16cex:durableId="1EABE1C4" w16cex:dateUtc="2026-04-06T09:52:00Z"/>
-</w16cex:commentsExtensible>
-</file>
-
-<file path=word/commentsIds.xml><?xml version="1.0" encoding="utf-8"?>
-<w16cid:commentsIds xmlns:wpc="http://schemas.microsoft.com/office/word/2010/wordprocessingCanvas" xmlns:cx="http://schemas.microsoft.com/office/drawing/2014/chartex" xmlns:cx1="http://schemas.microsoft.com/office/drawing/2015/9/8/chartex" xmlns:cx2="http://schemas.microsoft.com/office/drawing/2015/10/21/chartex" xmlns:cx3="http://schemas.microsoft.com/office/drawing/2016/5/9/chartex" xmlns:cx4="http://schemas.microsoft.com/office/drawing/2016/5/10/chartex" xmlns:cx5="http://schemas.microsoft.com/office/drawing/2016/5/11/chartex" xmlns:cx6="http://schemas.microsoft.com/office/drawing/2016/5/12/chartex" xmlns:cx7="http://schemas.microsoft.com/office/drawing/2016/5/13/chartex" xmlns:cx8="http://schemas.microsoft.com/office/drawing/2016/5/14/chartex" xmlns:mc="http://schemas.openxmlformats.org/markup-compatibility/2006" xmlns:aink="http://schemas.microsoft.com/office/drawing/2016/ink" xmlns:am3d="http://schemas.microsoft.com/office/drawing/2017/model3d" xmlns:o="urn:schemas-microsoft-com:office:office" xmlns:oel="http://schemas.microsoft.com/office/2019/extlst" xmlns:r="http://schemas.openxmlformats.org/officeDocument/2006/relationships" xmlns:m="http://schemas.openxmlformats.org/officeDocument/2006/math" xmlns:v="urn:schemas-microsoft-com:vml" xmlns:wp14="http://schemas.microsoft.com/office/word/2010/wordprocessingDrawing" xmlns:wp="http://schemas.openxmlformats.org/drawingml/2006/wordprocessingDrawing" xmlns:w10="urn:schemas-microsoft-com:office:word" xmlns:w="http://schemas.openxmlformats.org/wordprocessingml/2006/main" xmlns:w14="http://schemas.microsoft.com/office/word/2010/wordml" xmlns:w15="http://schemas.microsoft.com/office/word/2012/wordml" xmlns:w16cex="http://schemas.microsoft.com/office/word/2018/wordml/cex" xmlns:w16cid="http://schemas.microsoft.com/office/word/2016/wordml/cid" xmlns:w16="http://schemas.microsoft.com/office/word/2018/wordml" xmlns:w16du="http://schemas.microsoft.com/office/word/2023/wordml/word16du" xmlns:w16sdtdh="http://schemas.microsoft.com/office/word/2020/wordml/sdtdatahash" xmlns:w16sdtfl="http://schemas.microsoft.com/office/word/2024/wordml/sdtformatlock" xmlns:w16se="http://schemas.microsoft.com/office/word/2015/wordml/symex" xmlns:wpg="http://schemas.microsoft.com/office/word/2010/wordprocessingGroup" xmlns:wpi="http://schemas.microsoft.com/office/word/2010/wordprocessingInk" xmlns:wne="http://schemas.microsoft.com/office/word/2006/wordml" xmlns:wps="http://schemas.microsoft.com/office/word/2010/wordprocessingShape" mc:Ignorable="w14 w15 w16se w16cid w16 w16cex w16sdtdh w16sdtfl w16du wp14">
-  <w16cid:commentId w16cid:paraId="01A085CA" w16cid:durableId="22D8539F"/>
-  <w16cid:commentId w16cid:paraId="3707E922" w16cid:durableId="1EABE1C4"/>
-</w16cid:commentsIds>
-</file>
-
 <file path=word/endnotes.xml><?xml version="1.0" encoding="utf-8"?>
 <w:endnotes xmlns:wpc="http://schemas.microsoft.com/office/word/2010/wordprocessingCanvas" xmlns:cx="http://schemas.microsoft.com/office/drawing/2014/chartex" xmlns:cx1="http://schemas.microsoft.com/office/drawing/2015/9/8/chartex" xmlns:cx2="http://schemas.microsoft.com/office/drawing/2015/10/21/chartex" xmlns:cx3="http://schemas.microsoft.com/office/drawing/2016/5/9/chartex" xmlns:cx4="http://schemas.microsoft.com/office/drawing/2016/5/10/chartex" xmlns:cx5="http://schemas.microsoft.com/office/drawing/2016/5/11/chartex" xmlns:cx6="http://schemas.microsoft.com/office/drawing/2016/5/12/chartex" xmlns:cx7="http://schemas.microsoft.com/office/drawing/2016/5/13/chartex" xmlns:cx8="http://schemas.microsoft.com/office/drawing/2016/5/14/chartex" xmlns:mc="http://schemas.openxmlformats.org/markup-compatibility/2006" xmlns:aink="http://schemas.microsoft.com/office/drawing/2016/ink" xmlns:am3d="http://schemas.microsoft.com/office/drawing/2017/model3d" xmlns:o="urn:schemas-microsoft-com:office:office" xmlns:oel="http://schemas.microsoft.com/office/2019/extlst" xmlns:r="http://schemas.openxmlformats.org/officeDocument/2006/relationships" xmlns:m="http://schemas.openxmlformats.org/officeDocument/2006/math" xmlns:v="urn:schemas-microsoft-com:vml" xmlns:wp14="http://schemas.microsoft.com/office/word/2010/wordprocessingDrawing" xmlns:wp="http://schemas.openxmlformats.org/drawingml/2006/wordprocessingDrawing" xmlns:w10="urn:schemas-microsoft-com:office:word" xmlns:w="http://schemas.openxmlformats.org/wordprocessingml/2006/main" xmlns:w14="http://schemas.microsoft.com/office/word/2010/wordml" xmlns:w15="http://schemas.microsoft.com/office/word/2012/wordml" xmlns:w16cex="http://schemas.microsoft.com/office/word/2018/wordml/cex" xmlns:w16cid="http://schemas.microsoft.com/office/word/2016/wordml/cid" xmlns:w16="http://schemas.microsoft.com/office/word/2018/wordml" xmlns:w16du="http://schemas.microsoft.com/office/word/2023/wordml/word16du" xmlns:w16sdtdh="http://schemas.microsoft.com/office/word/2020/wordml/sdtdatahash" xmlns:w16sdtfl="http://schemas.microsoft.com/office/word/2024/wordml/sdtformatlock" xmlns:w16se="http://schemas.microsoft.com/office/word/2015/wordml/symex" xmlns:wpg="http://schemas.microsoft.com/office/word/2010/wordprocessingGroup" xmlns:wpi="http://schemas.microsoft.com/office/word/2010/wordprocessingInk" xmlns:wne="http://schemas.microsoft.com/office/word/2006/wordml" xmlns:wps="http://schemas.microsoft.com/office/word/2010/wordprocessingShape" mc:Ignorable="w14 w15 w16se w16cid w16 w16cex w16sdtdh w16sdtfl w16du wp14">
   <w:endnote w:type="separator" w:id="-1">
@@ -5227,7 +5413,15 @@
         <w:t>este</w:t>
       </w:r>
       <w:r>
-        <w:t xml:space="preserve"> caso hay tres años, así que se incluyen dos variables: una que vale 1 si la observación es de 2023 y 0 si no, y otra que vale 1 si es de 2024 y 0 si no. El año 2022 actúa como referencia. El modelo estima automáticamente el coeficiente de cada una de esas variables, y ese coeficiente es precisamente τt: cuánto cambia en promedio el resultado de todas las empresas en ese año respecto al año de referencia, una vez descontado todo lo demás.</w:t>
+        <w:t xml:space="preserve"> caso hay tres años, así que se incluyen dos variables: una que vale 1 si la observación es de 2023 y 0 si no, y otra que vale 1 si es de 2024 y 0 si no. El año 2022 actúa como referencia. El modelo estima automáticamente el coeficiente de cada una de esas variables, y ese coeficiente es precisamente </w:t>
+      </w:r>
+      <w:proofErr w:type="spellStart"/>
+      <w:r>
+        <w:t>τt</w:t>
+      </w:r>
+      <w:proofErr w:type="spellEnd"/>
+      <w:r>
+        <w:t>: cuánto cambia en promedio el resultado de todas las empresas en ese año respecto al año de referencia, una vez descontado todo lo demás.</w:t>
       </w:r>
     </w:p>
   </w:footnote>
@@ -5526,14 +5720,6 @@
     </w:lvlOverride>
   </w:num>
 </w:numbering>
-</file>
-
-<file path=word/people.xml><?xml version="1.0" encoding="utf-8"?>
-<w15:people xmlns:wpc="http://schemas.microsoft.com/office/word/2010/wordprocessingCanvas" xmlns:cx="http://schemas.microsoft.com/office/drawing/2014/chartex" xmlns:cx1="http://schemas.microsoft.com/office/drawing/2015/9/8/chartex" xmlns:cx2="http://schemas.microsoft.com/office/drawing/2015/10/21/chartex" xmlns:cx3="http://schemas.microsoft.com/office/drawing/2016/5/9/chartex" xmlns:cx4="http://schemas.microsoft.com/office/drawing/2016/5/10/chartex" xmlns:cx5="http://schemas.microsoft.com/office/drawing/2016/5/11/chartex" xmlns:cx6="http://schemas.microsoft.com/office/drawing/2016/5/12/chartex" xmlns:cx7="http://schemas.microsoft.com/office/drawing/2016/5/13/chartex" xmlns:cx8="http://schemas.microsoft.com/office/drawing/2016/5/14/chartex" xmlns:mc="http://schemas.openxmlformats.org/markup-compatibility/2006" xmlns:aink="http://schemas.microsoft.com/office/drawing/2016/ink" xmlns:am3d="http://schemas.microsoft.com/office/drawing/2017/model3d" xmlns:o="urn:schemas-microsoft-com:office:office" xmlns:oel="http://schemas.microsoft.com/office/2019/extlst" xmlns:r="http://schemas.openxmlformats.org/officeDocument/2006/relationships" xmlns:m="http://schemas.openxmlformats.org/officeDocument/2006/math" xmlns:v="urn:schemas-microsoft-com:vml" xmlns:wp14="http://schemas.microsoft.com/office/word/2010/wordprocessingDrawing" xmlns:wp="http://schemas.openxmlformats.org/drawingml/2006/wordprocessingDrawing" xmlns:w10="urn:schemas-microsoft-com:office:word" xmlns:w="http://schemas.openxmlformats.org/wordprocessingml/2006/main" xmlns:w14="http://schemas.microsoft.com/office/word/2010/wordml" xmlns:w15="http://schemas.microsoft.com/office/word/2012/wordml" xmlns:w16cex="http://schemas.microsoft.com/office/word/2018/wordml/cex" xmlns:w16cid="http://schemas.microsoft.com/office/word/2016/wordml/cid" xmlns:w16="http://schemas.microsoft.com/office/word/2018/wordml" xmlns:w16du="http://schemas.microsoft.com/office/word/2023/wordml/word16du" xmlns:w16sdtdh="http://schemas.microsoft.com/office/word/2020/wordml/sdtdatahash" xmlns:w16sdtfl="http://schemas.microsoft.com/office/word/2024/wordml/sdtformatlock" xmlns:w16se="http://schemas.microsoft.com/office/word/2015/wordml/symex" xmlns:wpg="http://schemas.microsoft.com/office/word/2010/wordprocessingGroup" xmlns:wpi="http://schemas.microsoft.com/office/word/2010/wordprocessingInk" xmlns:wne="http://schemas.microsoft.com/office/word/2006/wordml" xmlns:wps="http://schemas.microsoft.com/office/word/2010/wordprocessingShape" mc:Ignorable="w14 w15 w16se w16cid w16 w16cex w16sdtdh w16sdtfl w16du wp14">
-  <w15:person w15:author="Arturo M. Ronda">
-    <w15:presenceInfo w15:providerId="AD" w15:userId="S::arturo.mronda@grupo-acap.es::cdee4225-ae95-405c-af89-6c9dfebe956d"/>
-  </w15:person>
-</w15:people>
 </file>
 
 <file path=word/styles.xml><?xml version="1.0" encoding="utf-8"?>

</xml_diff>